<commit_message>
Rework contribution examples, navigation and template copy in V2
- Org & Community: blog posts and conference talks at every scope,
  deepening with each; DevDay organising at Direct and Extended and
  the flagship DevDay at Team and Wider; interviewing starts at Team
- Facets label reads "All three facets are expected"
- Scope and area pages lead back with "← Expectations", and area
  pages get Previous/Next links
- Areas are defined as "areas of impact" in the glossary and How it
  works; Client & Delivery no longer uses V1's "capabilities"
- Expectations template: plainer instructions and hints, rebuilt

Co-Authored-By: Claude Opus 5.5 <noreply@anthropic.com>
</commit_message>
<xml_diff>
--- a/v2/doc-templates/expectations.docx
+++ b/v2/doc-templates/expectations.docx
@@ -25,7 +25,7 @@
         <w:rPr>
           <w:color w:val="6B7280"/>
         </w:rPr>
-        <w:t xml:space="preserve">What matters for you this cycle, and later, what happened. Fill in the middle column at the start and the right one at the end. This is not a running log: keep your notes wherever suits you.</w:t>
+        <w:t xml:space="preserve">Fill in My expectations at the start of the cycle and your self-assessment at the end. Keep your feedback notes wherever you usually keep notes; they don't go in this doc.</w:t>
       </w:r>
     </w:p>
     <w:tbl>
@@ -174,9 +174,9 @@
         <w:rPr>
           <w:color w:val="6B7280"/>
         </w:rPr>
-        <w:t xml:space="preserve">What your scope expects is in the guide: </w:t>
+        <w:t xml:space="preserve">Your scope's expectations are in the guide: </w:t>
       </w:r>
-      <w:hyperlink w:history="1" r:id="rIdue7q6dlgzudpa3v_pigqr">
+      <w:hyperlink w:history="1" r:id="rIds0jidms5twce-esth7unq">
         <w:r>
           <w:rPr>
             <w:color w:val="18181B"/>
@@ -191,7 +191,7 @@
         </w:rPr>
         <w:t xml:space="preserve"> · </w:t>
       </w:r>
-      <w:hyperlink w:history="1" r:id="rId9b3izejxw48uvoycgu8zw">
+      <w:hyperlink w:history="1" r:id="rIdmafd2a_6qsumyijed6pbj">
         <w:r>
           <w:rPr>
             <w:color w:val="18181B"/>
@@ -206,7 +206,7 @@
         </w:rPr>
         <w:t xml:space="preserve"> · </w:t>
       </w:r>
-      <w:hyperlink w:history="1" r:id="rIdtmqf9468uwkews-gbwvbw">
+      <w:hyperlink w:history="1" r:id="rId85xcmoy9nr9wxde-knxmq">
         <w:r>
           <w:rPr>
             <w:color w:val="18181B"/>
@@ -221,7 +221,7 @@
         </w:rPr>
         <w:t xml:space="preserve"> · </w:t>
       </w:r>
-      <w:hyperlink w:history="1" r:id="rIdfvb9tf_s12hbqmdqd0qy6">
+      <w:hyperlink w:history="1" r:id="rIdaz_tyy5vafegywmvwbfk2">
         <w:r>
           <w:rPr>
             <w:color w:val="18181B"/>
@@ -234,17 +234,23 @@
         <w:rPr>
           <w:color w:val="6B7280"/>
         </w:rPr>
-        <w:t xml:space="preserve">. Add here only what is specific to you. </w:t>
+        <w:t xml:space="preserve">. Write here only what goes beyond them for your work this cycle, such as what your client or team needs from you. Before you write your self-assessment, read </w:t>
       </w:r>
-      <w:hyperlink w:history="1" r:id="rIdz4ty0tgqgppysrenaksxw">
+      <w:hyperlink w:history="1" r:id="rIdr7a5chmm8zoqnuwxccms7">
         <w:r>
           <w:rPr>
             <w:color w:val="18181B"/>
             <w:u w:val="single"/>
           </w:rPr>
-          <w:t xml:space="preserve">How to write a self-assessment</w:t>
+          <w:t xml:space="preserve">how to write one</w:t>
         </w:r>
       </w:hyperlink>
+      <w:r>
+        <w:rPr>
+          <w:color w:val="6B7280"/>
+        </w:rPr>
+        <w:t xml:space="preserve">.</w:t>
+      </w:r>
     </w:p>
     <w:tbl>
       <w:tblPr>
@@ -342,7 +348,7 @@
                 <w:sz w:val="16"/>
                 <w:szCs w:val="16"/>
               </w:rPr>
-              <w:t xml:space="preserve">At the start: what matters most this cycle</w:t>
+              <w:t xml:space="preserve">Start of the cycle: what you will focus on, beyond what your scope expects</w:t>
             </w:r>
           </w:p>
         </w:tc>
@@ -388,7 +394,7 @@
                 <w:sz w:val="16"/>
                 <w:szCs w:val="16"/>
               </w:rPr>
-              <w:t xml:space="preserve">At the end: what changed, and your part in it</w:t>
+              <w:t xml:space="preserve">End of the cycle: what changed because of you, with examples</w:t>
             </w:r>
           </w:p>
         </w:tc>
@@ -438,7 +444,7 @@
                 <w:sz w:val="17"/>
                 <w:szCs w:val="17"/>
               </w:rPr>
-              <w:t xml:space="preserve">What matters most in your work and for your client</w:t>
+              <w:t xml:space="preserve">Your client's priorities, and anything your project needs from you</w:t>
             </w:r>
           </w:p>
         </w:tc>
@@ -495,7 +501,7 @@
                 <w:sz w:val="16"/>
                 <w:szCs w:val="16"/>
               </w:rPr>
-              <w:t xml:space="preserve">My view:  </w:t>
+              <w:t xml:space="preserve">My rating:  </w:t>
             </w:r>
             <w:r>
               <w:rPr>
@@ -569,7 +575,7 @@
                 <w:sz w:val="17"/>
                 <w:szCs w:val="17"/>
               </w:rPr>
-              <w:t xml:space="preserve">What matters most for your team</w:t>
+              <w:t xml:space="preserve">What your team needs from you, such as onboarding or mentoring someone</w:t>
             </w:r>
           </w:p>
         </w:tc>
@@ -626,7 +632,7 @@
                 <w:sz w:val="16"/>
                 <w:szCs w:val="16"/>
               </w:rPr>
-              <w:t xml:space="preserve">My view:  </w:t>
+              <w:t xml:space="preserve">My rating:  </w:t>
             </w:r>
             <w:r>
               <w:rPr>
@@ -700,7 +706,7 @@
                 <w:sz w:val="17"/>
                 <w:szCs w:val="17"/>
               </w:rPr>
-              <w:t xml:space="preserve">Where you'd like to contribute beyond your immediate work</w:t>
+              <w:t xml:space="preserve">How you plan to contribute beyond your project</w:t>
             </w:r>
           </w:p>
         </w:tc>
@@ -757,7 +763,7 @@
                 <w:sz w:val="16"/>
                 <w:szCs w:val="16"/>
               </w:rPr>
-              <w:t xml:space="preserve">My view:  </w:t>
+              <w:t xml:space="preserve">My rating:  </w:t>
             </w:r>
             <w:r>
               <w:rPr>
@@ -848,7 +854,7 @@
                 <w:sz w:val="16"/>
                 <w:szCs w:val="16"/>
               </w:rPr>
-              <w:t xml:space="preserve">Where I want to grow: next-scope responsibilities I'd like to take on (optional)</w:t>
+              <w:t xml:space="preserve">Next-scope responsibilities you want to take on this cycle, if any</w:t>
             </w:r>
           </w:p>
           <w:p>
@@ -883,7 +889,7 @@
                 <w:sz w:val="16"/>
                 <w:szCs w:val="16"/>
               </w:rPr>
-              <w:t xml:space="preserve">Where I grew, and what next</w:t>
+              <w:t xml:space="preserve">How far you got with them, and what you want to take on next cycle</w:t>
             </w:r>
           </w:p>
           <w:p>

</xml_diff>

<commit_message>
Bring the FAQ, glossary, template and decisions in line
Answer whether delivering on time is enough, handing over part of your
work, what's next when you're strong everywhere, and skipping work you
don't enjoy. Add glossary entries for delivery ownership, the mid-cycle
check and specialist agreements, an Agreements row in the doc template,
and record the new decisions in the README and HANDOFF.

Co-Authored-By: Claude Opus 5.5 <noreply@anthropic.com>
</commit_message>
<xml_diff>
--- a/v2/doc-templates/expectations.docx
+++ b/v2/doc-templates/expectations.docx
@@ -176,7 +176,7 @@
         </w:rPr>
         <w:t xml:space="preserve">Your scope's expectations are in the guide: </w:t>
       </w:r>
-      <w:hyperlink w:history="1" r:id="rIds0jidms5twce-esth7unq">
+      <w:hyperlink w:history="1" r:id="rIdslspjjabldum9eu0bnmp4">
         <w:r>
           <w:rPr>
             <w:color w:val="18181B"/>
@@ -191,7 +191,7 @@
         </w:rPr>
         <w:t xml:space="preserve"> · </w:t>
       </w:r>
-      <w:hyperlink w:history="1" r:id="rIdmafd2a_6qsumyijed6pbj">
+      <w:hyperlink w:history="1" r:id="rIdbkvv_ujy0bjg7675nyxxf">
         <w:r>
           <w:rPr>
             <w:color w:val="18181B"/>
@@ -206,7 +206,7 @@
         </w:rPr>
         <w:t xml:space="preserve"> · </w:t>
       </w:r>
-      <w:hyperlink w:history="1" r:id="rId85xcmoy9nr9wxde-knxmq">
+      <w:hyperlink w:history="1" r:id="rIdnf-yb5g8n4kajdke_ekdz">
         <w:r>
           <w:rPr>
             <w:color w:val="18181B"/>
@@ -221,7 +221,7 @@
         </w:rPr>
         <w:t xml:space="preserve"> · </w:t>
       </w:r>
-      <w:hyperlink w:history="1" r:id="rIdaz_tyy5vafegywmvwbfk2">
+      <w:hyperlink w:history="1" r:id="rIdkgasqct8dehtid-nprndb">
         <w:r>
           <w:rPr>
             <w:color w:val="18181B"/>
@@ -234,9 +234,9 @@
         <w:rPr>
           <w:color w:val="6B7280"/>
         </w:rPr>
-        <w:t xml:space="preserve">. Write here only what goes beyond them for your work this cycle, such as what your client or team needs from you. Before you write your self-assessment, read </w:t>
+        <w:t xml:space="preserve">. Write here only what goes beyond them for your work this cycle, such as what your client or team needs from you, and any agreement that changes them. Before you write your self-assessment, read </w:t>
       </w:r>
-      <w:hyperlink w:history="1" r:id="rIdr7a5chmm8zoqnuwxccms7">
+      <w:hyperlink w:history="1" r:id="rIdgninof_qaawoclozls2da">
         <w:r>
           <w:rPr>
             <w:color w:val="18181B"/>
@@ -789,6 +789,113 @@
               </w:rPr>
               <w:t xml:space="preserve">☐ Exceeds    </w:t>
             </w:r>
+          </w:p>
+        </w:tc>
+      </w:tr>
+      <w:tr>
+        <w:trPr>
+          <w:cantSplit/>
+          <w:trHeight w:val="1300" w:hRule="atLeast"/>
+        </w:trPr>
+        <w:tc>
+          <w:tcPr>
+            <w:tcW w:type="dxa" w:w="2200"/>
+            <w:tcBorders>
+              <w:top w:val="single" w:color="E4E4E7" w:sz="4"/>
+              <w:left w:val="single" w:color="18181B" w:sz="24"/>
+              <w:bottom w:val="single" w:color="E4E4E7" w:sz="4"/>
+              <w:right w:val="single" w:color="E4E4E7" w:sz="4"/>
+            </w:tcBorders>
+            <w:shd w:fill="F7F7F8" w:color="auto" w:val="clear"/>
+            <w:tcMar>
+              <w:top w:type="dxa" w:w="120"/>
+              <w:left w:type="dxa" w:w="180"/>
+              <w:bottom w:type="dxa" w:w="120"/>
+              <w:right w:type="dxa" w:w="180"/>
+            </w:tcMar>
+          </w:tcPr>
+          <w:p>
+            <w:pPr>
+              <w:spacing w:after="0"/>
+            </w:pPr>
+            <w:r>
+              <w:rPr>
+                <w:b/>
+                <w:bCs/>
+                <w:color w:val="18181B"/>
+              </w:rPr>
+              <w:t xml:space="preserve">Agreements</w:t>
+            </w:r>
+          </w:p>
+        </w:tc>
+        <w:tc>
+          <w:tcPr>
+            <w:tcW w:type="dxa" w:w="3753"/>
+            <w:tcBorders>
+              <w:top w:val="single" w:color="E4E4E7" w:sz="4"/>
+              <w:left w:val="single" w:color="E4E4E7" w:sz="4"/>
+              <w:bottom w:val="single" w:color="E4E4E7" w:sz="4"/>
+              <w:right w:val="single" w:color="E4E4E7" w:sz="4"/>
+            </w:tcBorders>
+            <w:tcMar>
+              <w:top w:type="dxa" w:w="120"/>
+              <w:left w:type="dxa" w:w="180"/>
+              <w:bottom w:type="dxa" w:w="120"/>
+              <w:right w:type="dxa" w:w="180"/>
+            </w:tcMar>
+          </w:tcPr>
+          <w:p>
+            <w:pPr>
+              <w:spacing w:after="60"/>
+            </w:pPr>
+            <w:r>
+              <w:rPr>
+                <w:color w:val="6B7280"/>
+                <w:sz w:val="16"/>
+                <w:szCs w:val="16"/>
+              </w:rPr>
+              <w:t xml:space="preserve">Any specialist agreement (your strength, the responsibility you hand over, the teammate who takes it, your stronger contribution) or agreed deferral, each with a review date</w:t>
+            </w:r>
+          </w:p>
+          <w:p>
+            <w:pPr>
+              <w:spacing w:after="500"/>
+            </w:pPr>
+          </w:p>
+        </w:tc>
+        <w:tc>
+          <w:tcPr>
+            <w:tcW w:type="dxa" w:w="3753"/>
+            <w:tcBorders>
+              <w:top w:val="single" w:color="E4E4E7" w:sz="4"/>
+              <w:left w:val="single" w:color="E4E4E7" w:sz="4"/>
+              <w:bottom w:val="single" w:color="E4E4E7" w:sz="4"/>
+              <w:right w:val="single" w:color="E4E4E7" w:sz="4"/>
+            </w:tcBorders>
+            <w:tcMar>
+              <w:top w:type="dxa" w:w="120"/>
+              <w:left w:type="dxa" w:w="180"/>
+              <w:bottom w:type="dxa" w:w="120"/>
+              <w:right w:type="dxa" w:w="180"/>
+            </w:tcMar>
+          </w:tcPr>
+          <w:p>
+            <w:pPr>
+              <w:spacing w:after="60"/>
+            </w:pPr>
+            <w:r>
+              <w:rPr>
+                <w:color w:val="6B7280"/>
+                <w:sz w:val="16"/>
+                <w:szCs w:val="16"/>
+              </w:rPr>
+              <w:t xml:space="preserve">How each agreement worked, for you and for the teammate involved</w:t>
+            </w:r>
+          </w:p>
+          <w:p>
+            <w:pPr>
+              <w:spacing w:after="500"/>
+            </w:pPr>
           </w:p>
         </w:tc>
       </w:tr>

</xml_diff>

<commit_message>
Stop using the word reviewer in the guide, film and doc template
Name the people as teammates, drop the glossary's Reviewers entry, and
put back the film's line about keeping notes for the end of the cycle.

Co-Authored-By: Claude Opus 5.5 <noreply@anthropic.com>
</commit_message>
<xml_diff>
--- a/v2/doc-templates/expectations.docx
+++ b/v2/doc-templates/expectations.docx
@@ -176,7 +176,7 @@
         </w:rPr>
         <w:t xml:space="preserve">Your scope's expectations are in the guide: </w:t>
       </w:r>
-      <w:hyperlink w:history="1" r:id="rIdslspjjabldum9eu0bnmp4">
+      <w:hyperlink w:history="1" r:id="rIdeq2dyvt15r1xoir5e6-c-">
         <w:r>
           <w:rPr>
             <w:color w:val="18181B"/>
@@ -191,7 +191,7 @@
         </w:rPr>
         <w:t xml:space="preserve"> · </w:t>
       </w:r>
-      <w:hyperlink w:history="1" r:id="rIdbkvv_ujy0bjg7675nyxxf">
+      <w:hyperlink w:history="1" r:id="rIdudwpmwlacomsidfg9d-bk">
         <w:r>
           <w:rPr>
             <w:color w:val="18181B"/>
@@ -206,7 +206,7 @@
         </w:rPr>
         <w:t xml:space="preserve"> · </w:t>
       </w:r>
-      <w:hyperlink w:history="1" r:id="rIdnf-yb5g8n4kajdke_ekdz">
+      <w:hyperlink w:history="1" r:id="rId7zng02sugmwuv5vzu0ela">
         <w:r>
           <w:rPr>
             <w:color w:val="18181B"/>
@@ -221,7 +221,7 @@
         </w:rPr>
         <w:t xml:space="preserve"> · </w:t>
       </w:r>
-      <w:hyperlink w:history="1" r:id="rIdkgasqct8dehtid-nprndb">
+      <w:hyperlink w:history="1" r:id="rIdkpt84n7ep5bm2or86wdtl">
         <w:r>
           <w:rPr>
             <w:color w:val="18181B"/>
@@ -236,7 +236,7 @@
         </w:rPr>
         <w:t xml:space="preserve">. Write here only what goes beyond them for your work this cycle, such as what your client or team needs from you, and any agreement that changes them. Before you write your self-assessment, read </w:t>
       </w:r>
-      <w:hyperlink w:history="1" r:id="rIdgninof_qaawoclozls2da">
+      <w:hyperlink w:history="1" r:id="rIdamk1iw8_emip0tmtmrw3z">
         <w:r>
           <w:rPr>
             <w:color w:val="18181B"/>
@@ -854,7 +854,7 @@
                 <w:sz w:val="16"/>
                 <w:szCs w:val="16"/>
               </w:rPr>
-              <w:t xml:space="preserve">Any specialist agreement (your strength, the responsibility you hand over, the teammate who takes it, your stronger contribution) or agreed deferral, each with a review date</w:t>
+              <w:t xml:space="preserve">Any specialist agreement (your strength, the responsibility you hand over, the teammate who takes it, your stronger contribution) or agreed deferral, each with a date to look at it again</w:t>
             </w:r>
           </w:p>
           <w:p>

</xml_diff>

<commit_message>
Agree a shape of work, judge scope against it, and let scope grow
An agreed focus replaces specialist agreements: at Extended and above,
depth already shown lets someone take less of particular
responsibilities, which a teammate with room takes on, for a greater
contribution in return. Standards stay with everyone, and each area and
the scope are judged against the agreed focus. The greater
contribution is required and can earn Exceeds. Growth includes
deepening at your current scope; a long stay at one scope leads to a
development goal rather than a compulsory stretch. Scope grows rather
than being raised. Each quarterly team check looks ahead instead of a
mid-cycle check. The Wider Below example names the real shortfall.

Co-Authored-By: Claude Opus 5.5 <noreply@anthropic.com>
</commit_message>
<xml_diff>
--- a/v2/doc-templates/expectations.docx
+++ b/v2/doc-templates/expectations.docx
@@ -176,7 +176,7 @@
         </w:rPr>
         <w:t xml:space="preserve">Your scope's expectations are in the guide: </w:t>
       </w:r>
-      <w:hyperlink w:history="1" r:id="rIdeq2dyvt15r1xoir5e6-c-">
+      <w:hyperlink w:history="1" r:id="rIdxg41xshjr1mdpp2q1dvyf">
         <w:r>
           <w:rPr>
             <w:color w:val="18181B"/>
@@ -191,7 +191,7 @@
         </w:rPr>
         <w:t xml:space="preserve"> · </w:t>
       </w:r>
-      <w:hyperlink w:history="1" r:id="rIdudwpmwlacomsidfg9d-bk">
+      <w:hyperlink w:history="1" r:id="rIdssuqyhds9z0b3sb00dreh">
         <w:r>
           <w:rPr>
             <w:color w:val="18181B"/>
@@ -206,7 +206,7 @@
         </w:rPr>
         <w:t xml:space="preserve"> · </w:t>
       </w:r>
-      <w:hyperlink w:history="1" r:id="rId7zng02sugmwuv5vzu0ela">
+      <w:hyperlink w:history="1" r:id="rIdvii2v3rcibzxikxqfuioc">
         <w:r>
           <w:rPr>
             <w:color w:val="18181B"/>
@@ -221,7 +221,7 @@
         </w:rPr>
         <w:t xml:space="preserve"> · </w:t>
       </w:r>
-      <w:hyperlink w:history="1" r:id="rIdkpt84n7ep5bm2or86wdtl">
+      <w:hyperlink w:history="1" r:id="rId7xwblcp6u6j9ap14f85l3">
         <w:r>
           <w:rPr>
             <w:color w:val="18181B"/>
@@ -236,7 +236,7 @@
         </w:rPr>
         <w:t xml:space="preserve">. Write here only what goes beyond them for your work this cycle, such as what your client or team needs from you, and any agreement that changes them. Before you write your self-assessment, read </w:t>
       </w:r>
-      <w:hyperlink w:history="1" r:id="rIdamk1iw8_emip0tmtmrw3z">
+      <w:hyperlink w:history="1" r:id="rIdh6uyvtmxgav8bwismigs8">
         <w:r>
           <w:rPr>
             <w:color w:val="18181B"/>
@@ -854,7 +854,7 @@
                 <w:sz w:val="16"/>
                 <w:szCs w:val="16"/>
               </w:rPr>
-              <w:t xml:space="preserve">Any specialist agreement (your strength, the responsibility you hand over, the teammate who takes it, your stronger contribution) or agreed deferral, each with a date to look at it again</w:t>
+              <w:t xml:space="preserve">Any agreed focus (where you contribute most, what you take less of, the teammate who takes it on, your greater contribution) or agreed deferral, each with a date to look at it again</w:t>
             </w:r>
           </w:p>
           <w:p>

</xml_diff>

<commit_message>
Keep 'what you take less of' out of the expectations doc
The template's Agreements row asks for the strength you contribute most
through and the greater contribution you'll make, so the doc everyone
fills in doesn't read as an invitation to drop responsibilities. The
expectations page points to an agreed focus the same way.

Co-Authored-By: Claude Opus 5.5 <noreply@anthropic.com>
</commit_message>
<xml_diff>
--- a/v2/doc-templates/expectations.docx
+++ b/v2/doc-templates/expectations.docx
@@ -176,7 +176,7 @@
         </w:rPr>
         <w:t xml:space="preserve">Your scope's expectations are in the guide: </w:t>
       </w:r>
-      <w:hyperlink w:history="1" r:id="rIdxg41xshjr1mdpp2q1dvyf">
+      <w:hyperlink w:history="1" r:id="rIddyew866yv-ppwcszdqcz2">
         <w:r>
           <w:rPr>
             <w:color w:val="18181B"/>
@@ -191,7 +191,7 @@
         </w:rPr>
         <w:t xml:space="preserve"> · </w:t>
       </w:r>
-      <w:hyperlink w:history="1" r:id="rIdssuqyhds9z0b3sb00dreh">
+      <w:hyperlink w:history="1" r:id="rIdhsxdihxingruhv8jundla">
         <w:r>
           <w:rPr>
             <w:color w:val="18181B"/>
@@ -206,7 +206,7 @@
         </w:rPr>
         <w:t xml:space="preserve"> · </w:t>
       </w:r>
-      <w:hyperlink w:history="1" r:id="rIdvii2v3rcibzxikxqfuioc">
+      <w:hyperlink w:history="1" r:id="rIdacgawrpmxotscuy1j4fwr">
         <w:r>
           <w:rPr>
             <w:color w:val="18181B"/>
@@ -221,7 +221,7 @@
         </w:rPr>
         <w:t xml:space="preserve"> · </w:t>
       </w:r>
-      <w:hyperlink w:history="1" r:id="rId7xwblcp6u6j9ap14f85l3">
+      <w:hyperlink w:history="1" r:id="rIdkqd482tvfez4lijgkr-qy">
         <w:r>
           <w:rPr>
             <w:color w:val="18181B"/>
@@ -236,7 +236,7 @@
         </w:rPr>
         <w:t xml:space="preserve">. Write here only what goes beyond them for your work this cycle, such as what your client or team needs from you, and any agreement that changes them. Before you write your self-assessment, read </w:t>
       </w:r>
-      <w:hyperlink w:history="1" r:id="rIdh6uyvtmxgav8bwismigs8">
+      <w:hyperlink w:history="1" r:id="rIdeqnf1chg1rughcq-750fb">
         <w:r>
           <w:rPr>
             <w:color w:val="18181B"/>
@@ -854,7 +854,7 @@
                 <w:sz w:val="16"/>
                 <w:szCs w:val="16"/>
               </w:rPr>
-              <w:t xml:space="preserve">Any agreed focus (where you contribute most, what you take less of, the teammate who takes it on, your greater contribution) or agreed deferral, each with a date to look at it again</w:t>
+              <w:t xml:space="preserve">Any agreed focus (the strength you contribute most through, and the greater contribution you will make) or agreed deferral, each with a date to look at it again</w:t>
             </w:r>
           </w:p>
           <w:p>

</xml_diff>

<commit_message>
Remove the Self-assessment column from the expectations doc
The doc now holds only what's expected this cycle: one My expectations
column beside each area, agreements and growth, with no rating line or
end-of-cycle prompts.

Co-Authored-By: Claude Opus 5.5 <noreply@anthropic.com>
</commit_message>
<xml_diff>
--- a/v2/doc-templates/expectations.docx
+++ b/v2/doc-templates/expectations.docx
@@ -25,7 +25,7 @@
         <w:rPr>
           <w:color w:val="6B7280"/>
         </w:rPr>
-        <w:t xml:space="preserve">Fill in My expectations at the start of the cycle and your self-assessment at the end. Keep your feedback notes wherever you usually keep notes; they don't go in this doc.</w:t>
+        <w:t xml:space="preserve">Fill this in at the start of the cycle, and change it if what's expected of you changes during the cycle. Keep your feedback notes wherever you usually keep notes; they don't go in this doc.</w:t>
       </w:r>
     </w:p>
     <w:tbl>
@@ -176,7 +176,7 @@
         </w:rPr>
         <w:t xml:space="preserve">Your scope's expectations are in the guide: </w:t>
       </w:r>
-      <w:hyperlink w:history="1" r:id="rId40-n-nkhpd_vekriztdjq">
+      <w:hyperlink w:history="1" r:id="rIdeodtmkqoug542qad0z6jc">
         <w:r>
           <w:rPr>
             <w:color w:val="18181B"/>
@@ -191,7 +191,7 @@
         </w:rPr>
         <w:t xml:space="preserve"> · </w:t>
       </w:r>
-      <w:hyperlink w:history="1" r:id="rId2n3hwkajgxd1eh7ov3x-i">
+      <w:hyperlink w:history="1" r:id="rIdh8roqrskwj3io-jcnzamr">
         <w:r>
           <w:rPr>
             <w:color w:val="18181B"/>
@@ -206,7 +206,7 @@
         </w:rPr>
         <w:t xml:space="preserve"> · </w:t>
       </w:r>
-      <w:hyperlink w:history="1" r:id="rIdg5aboya_lqyg6pbh6t1j-">
+      <w:hyperlink w:history="1" r:id="rIdms6hwdclclskknbacetzm">
         <w:r>
           <w:rPr>
             <w:color w:val="18181B"/>
@@ -221,7 +221,7 @@
         </w:rPr>
         <w:t xml:space="preserve"> · </w:t>
       </w:r>
-      <w:hyperlink w:history="1" r:id="rIdy0iyuq77n4zdk52bc--x_">
+      <w:hyperlink w:history="1" r:id="rIdcfgvy9fbs0qtx2aw--nx-">
         <w:r>
           <w:rPr>
             <w:color w:val="18181B"/>
@@ -234,22 +234,7 @@
         <w:rPr>
           <w:color w:val="6B7280"/>
         </w:rPr>
-        <w:t xml:space="preserve">. Write here only what goes beyond them for your work this cycle, such as what your client or team needs from you, and any agreement that changes them. Before you write your self-assessment, read </w:t>
-      </w:r>
-      <w:hyperlink w:history="1" r:id="rId7f5j7iar8igxhbdfa2nhx">
-        <w:r>
-          <w:rPr>
-            <w:color w:val="18181B"/>
-            <w:u w:val="single"/>
-          </w:rPr>
-          <w:t xml:space="preserve">how to write one</w:t>
-        </w:r>
-      </w:hyperlink>
-      <w:r>
-        <w:rPr>
-          <w:color w:val="6B7280"/>
-        </w:rPr>
-        <w:t xml:space="preserve">.</w:t>
+        <w:t xml:space="preserve">. Write here only what goes beyond them for your work this cycle, such as what your client or team needs from you, and any agreement that changes them.</w:t>
       </w:r>
     </w:p>
     <w:tbl>
@@ -266,8 +251,7 @@
       </w:tblPr>
       <w:tblGrid>
         <w:gridCol w:w="2200"/>
-        <w:gridCol w:w="3753"/>
-        <w:gridCol w:w="3753"/>
+        <w:gridCol w:w="7506"/>
       </w:tblGrid>
       <w:tr>
         <w:trPr>
@@ -308,7 +292,7 @@
         </w:tc>
         <w:tc>
           <w:tcPr>
-            <w:tcW w:type="dxa" w:w="3753"/>
+            <w:tcW w:type="dxa" w:w="7506"/>
             <w:tcBorders>
               <w:top w:val="single" w:color="E4E4E7" w:sz="4"/>
               <w:left w:val="single" w:color="E4E4E7" w:sz="4"/>
@@ -348,53 +332,7 @@
                 <w:sz w:val="16"/>
                 <w:szCs w:val="16"/>
               </w:rPr>
-              <w:t xml:space="preserve">Start of the cycle: what you will focus on, beyond what your scope expects</w:t>
-            </w:r>
-          </w:p>
-        </w:tc>
-        <w:tc>
-          <w:tcPr>
-            <w:tcW w:type="dxa" w:w="3753"/>
-            <w:tcBorders>
-              <w:top w:val="single" w:color="E4E4E7" w:sz="4"/>
-              <w:left w:val="single" w:color="E4E4E7" w:sz="4"/>
-              <w:bottom w:val="single" w:color="E4E4E7" w:sz="4"/>
-              <w:right w:val="single" w:color="E4E4E7" w:sz="4"/>
-            </w:tcBorders>
-            <w:shd w:fill="F7F7F8" w:color="auto" w:val="clear"/>
-            <w:tcMar>
-              <w:top w:type="dxa" w:w="120"/>
-              <w:left w:type="dxa" w:w="180"/>
-              <w:bottom w:type="dxa" w:w="120"/>
-              <w:right w:type="dxa" w:w="180"/>
-            </w:tcMar>
-          </w:tcPr>
-          <w:p>
-            <w:pPr>
-              <w:spacing w:after="10"/>
-            </w:pPr>
-            <w:r>
-              <w:rPr>
-                <w:b/>
-                <w:bCs/>
-                <w:color w:val="18181B"/>
-                <w:sz w:val="19"/>
-                <w:szCs w:val="19"/>
-              </w:rPr>
-              <w:t xml:space="preserve">Self-assessment</w:t>
-            </w:r>
-          </w:p>
-          <w:p>
-            <w:pPr>
-              <w:spacing w:after="0"/>
-            </w:pPr>
-            <w:r>
-              <w:rPr>
-                <w:color w:val="6B7280"/>
-                <w:sz w:val="16"/>
-                <w:szCs w:val="16"/>
-              </w:rPr>
-              <w:t xml:space="preserve">End of the cycle: what changed because of you, with examples</w:t>
+              <w:t xml:space="preserve">What you will focus on this cycle, beyond what your scope expects</w:t>
             </w:r>
           </w:p>
         </w:tc>
@@ -450,7 +388,7 @@
         </w:tc>
         <w:tc>
           <w:tcPr>
-            <w:tcW w:type="dxa" w:w="3753"/>
+            <w:tcW w:type="dxa" w:w="7506"/>
             <w:tcBorders>
               <w:top w:val="single" w:color="E4E4E7" w:sz="4"/>
               <w:left w:val="single" w:color="E4E4E7" w:sz="4"/>
@@ -468,65 +406,6 @@
             <w:pPr>
               <w:spacing w:after="900"/>
             </w:pPr>
-          </w:p>
-        </w:tc>
-        <w:tc>
-          <w:tcPr>
-            <w:tcW w:type="dxa" w:w="3753"/>
-            <w:tcBorders>
-              <w:top w:val="single" w:color="E4E4E7" w:sz="4"/>
-              <w:left w:val="single" w:color="E4E4E7" w:sz="4"/>
-              <w:bottom w:val="single" w:color="E4E4E7" w:sz="4"/>
-              <w:right w:val="single" w:color="E4E4E7" w:sz="4"/>
-            </w:tcBorders>
-            <w:tcMar>
-              <w:top w:type="dxa" w:w="120"/>
-              <w:left w:type="dxa" w:w="180"/>
-              <w:bottom w:type="dxa" w:w="120"/>
-              <w:right w:type="dxa" w:w="180"/>
-            </w:tcMar>
-          </w:tcPr>
-          <w:p>
-            <w:pPr>
-              <w:spacing w:after="900"/>
-            </w:pPr>
-          </w:p>
-          <w:p>
-            <w:pPr>
-              <w:spacing w:after="0" w:before="60"/>
-            </w:pPr>
-            <w:r>
-              <w:rPr>
-                <w:color w:val="6B7280"/>
-                <w:sz w:val="16"/>
-                <w:szCs w:val="16"/>
-              </w:rPr>
-              <w:t xml:space="preserve">My rating:  </w:t>
-            </w:r>
-            <w:r>
-              <w:rPr>
-                <w:color w:val="6B7280"/>
-                <w:sz w:val="16"/>
-                <w:szCs w:val="16"/>
-              </w:rPr>
-              <w:t xml:space="preserve">☐ Below    </w:t>
-            </w:r>
-            <w:r>
-              <w:rPr>
-                <w:color w:val="6B7280"/>
-                <w:sz w:val="16"/>
-                <w:szCs w:val="16"/>
-              </w:rPr>
-              <w:t xml:space="preserve">☐ Meets    </w:t>
-            </w:r>
-            <w:r>
-              <w:rPr>
-                <w:color w:val="6B7280"/>
-                <w:sz w:val="16"/>
-                <w:szCs w:val="16"/>
-              </w:rPr>
-              <w:t xml:space="preserve">☐ Exceeds    </w:t>
-            </w:r>
           </w:p>
         </w:tc>
       </w:tr>
@@ -581,7 +460,7 @@
         </w:tc>
         <w:tc>
           <w:tcPr>
-            <w:tcW w:type="dxa" w:w="3753"/>
+            <w:tcW w:type="dxa" w:w="7506"/>
             <w:tcBorders>
               <w:top w:val="single" w:color="E4E4E7" w:sz="4"/>
               <w:left w:val="single" w:color="E4E4E7" w:sz="4"/>
@@ -599,65 +478,6 @@
             <w:pPr>
               <w:spacing w:after="900"/>
             </w:pPr>
-          </w:p>
-        </w:tc>
-        <w:tc>
-          <w:tcPr>
-            <w:tcW w:type="dxa" w:w="3753"/>
-            <w:tcBorders>
-              <w:top w:val="single" w:color="E4E4E7" w:sz="4"/>
-              <w:left w:val="single" w:color="E4E4E7" w:sz="4"/>
-              <w:bottom w:val="single" w:color="E4E4E7" w:sz="4"/>
-              <w:right w:val="single" w:color="E4E4E7" w:sz="4"/>
-            </w:tcBorders>
-            <w:tcMar>
-              <w:top w:type="dxa" w:w="120"/>
-              <w:left w:type="dxa" w:w="180"/>
-              <w:bottom w:type="dxa" w:w="120"/>
-              <w:right w:type="dxa" w:w="180"/>
-            </w:tcMar>
-          </w:tcPr>
-          <w:p>
-            <w:pPr>
-              <w:spacing w:after="900"/>
-            </w:pPr>
-          </w:p>
-          <w:p>
-            <w:pPr>
-              <w:spacing w:after="0" w:before="60"/>
-            </w:pPr>
-            <w:r>
-              <w:rPr>
-                <w:color w:val="6B7280"/>
-                <w:sz w:val="16"/>
-                <w:szCs w:val="16"/>
-              </w:rPr>
-              <w:t xml:space="preserve">My rating:  </w:t>
-            </w:r>
-            <w:r>
-              <w:rPr>
-                <w:color w:val="6B7280"/>
-                <w:sz w:val="16"/>
-                <w:szCs w:val="16"/>
-              </w:rPr>
-              <w:t xml:space="preserve">☐ Below    </w:t>
-            </w:r>
-            <w:r>
-              <w:rPr>
-                <w:color w:val="6B7280"/>
-                <w:sz w:val="16"/>
-                <w:szCs w:val="16"/>
-              </w:rPr>
-              <w:t xml:space="preserve">☐ Meets    </w:t>
-            </w:r>
-            <w:r>
-              <w:rPr>
-                <w:color w:val="6B7280"/>
-                <w:sz w:val="16"/>
-                <w:szCs w:val="16"/>
-              </w:rPr>
-              <w:t xml:space="preserve">☐ Exceeds    </w:t>
-            </w:r>
           </w:p>
         </w:tc>
       </w:tr>
@@ -712,7 +532,7 @@
         </w:tc>
         <w:tc>
           <w:tcPr>
-            <w:tcW w:type="dxa" w:w="3753"/>
+            <w:tcW w:type="dxa" w:w="7506"/>
             <w:tcBorders>
               <w:top w:val="single" w:color="E4E4E7" w:sz="4"/>
               <w:left w:val="single" w:color="E4E4E7" w:sz="4"/>
@@ -730,65 +550,6 @@
             <w:pPr>
               <w:spacing w:after="900"/>
             </w:pPr>
-          </w:p>
-        </w:tc>
-        <w:tc>
-          <w:tcPr>
-            <w:tcW w:type="dxa" w:w="3753"/>
-            <w:tcBorders>
-              <w:top w:val="single" w:color="E4E4E7" w:sz="4"/>
-              <w:left w:val="single" w:color="E4E4E7" w:sz="4"/>
-              <w:bottom w:val="single" w:color="E4E4E7" w:sz="4"/>
-              <w:right w:val="single" w:color="E4E4E7" w:sz="4"/>
-            </w:tcBorders>
-            <w:tcMar>
-              <w:top w:type="dxa" w:w="120"/>
-              <w:left w:type="dxa" w:w="180"/>
-              <w:bottom w:type="dxa" w:w="120"/>
-              <w:right w:type="dxa" w:w="180"/>
-            </w:tcMar>
-          </w:tcPr>
-          <w:p>
-            <w:pPr>
-              <w:spacing w:after="900"/>
-            </w:pPr>
-          </w:p>
-          <w:p>
-            <w:pPr>
-              <w:spacing w:after="0" w:before="60"/>
-            </w:pPr>
-            <w:r>
-              <w:rPr>
-                <w:color w:val="6B7280"/>
-                <w:sz w:val="16"/>
-                <w:szCs w:val="16"/>
-              </w:rPr>
-              <w:t xml:space="preserve">My rating:  </w:t>
-            </w:r>
-            <w:r>
-              <w:rPr>
-                <w:color w:val="6B7280"/>
-                <w:sz w:val="16"/>
-                <w:szCs w:val="16"/>
-              </w:rPr>
-              <w:t xml:space="preserve">☐ Below    </w:t>
-            </w:r>
-            <w:r>
-              <w:rPr>
-                <w:color w:val="6B7280"/>
-                <w:sz w:val="16"/>
-                <w:szCs w:val="16"/>
-              </w:rPr>
-              <w:t xml:space="preserve">☐ Meets    </w:t>
-            </w:r>
-            <w:r>
-              <w:rPr>
-                <w:color w:val="6B7280"/>
-                <w:sz w:val="16"/>
-                <w:szCs w:val="16"/>
-              </w:rPr>
-              <w:t xml:space="preserve">☐ Exceeds    </w:t>
-            </w:r>
           </w:p>
         </w:tc>
       </w:tr>
@@ -830,7 +591,7 @@
         </w:tc>
         <w:tc>
           <w:tcPr>
-            <w:tcW w:type="dxa" w:w="3753"/>
+            <w:tcW w:type="dxa" w:w="7506"/>
             <w:tcBorders>
               <w:top w:val="single" w:color="E4E4E7" w:sz="4"/>
               <w:left w:val="single" w:color="E4E4E7" w:sz="4"/>
@@ -855,41 +616,6 @@
                 <w:szCs w:val="16"/>
               </w:rPr>
               <w:t xml:space="preserve">Any agreed focus (the strength you contribute most through, and the greater contribution you will make) or agreed deferral, each with a date to look at it again</w:t>
-            </w:r>
-          </w:p>
-          <w:p>
-            <w:pPr>
-              <w:spacing w:after="500"/>
-            </w:pPr>
-          </w:p>
-        </w:tc>
-        <w:tc>
-          <w:tcPr>
-            <w:tcW w:type="dxa" w:w="3753"/>
-            <w:tcBorders>
-              <w:top w:val="single" w:color="E4E4E7" w:sz="4"/>
-              <w:left w:val="single" w:color="E4E4E7" w:sz="4"/>
-              <w:bottom w:val="single" w:color="E4E4E7" w:sz="4"/>
-              <w:right w:val="single" w:color="E4E4E7" w:sz="4"/>
-            </w:tcBorders>
-            <w:tcMar>
-              <w:top w:type="dxa" w:w="120"/>
-              <w:left w:type="dxa" w:w="180"/>
-              <w:bottom w:type="dxa" w:w="120"/>
-              <w:right w:type="dxa" w:w="180"/>
-            </w:tcMar>
-          </w:tcPr>
-          <w:p>
-            <w:pPr>
-              <w:spacing w:after="60"/>
-            </w:pPr>
-            <w:r>
-              <w:rPr>
-                <w:color w:val="6B7280"/>
-                <w:sz w:val="16"/>
-                <w:szCs w:val="16"/>
-              </w:rPr>
-              <w:t xml:space="preserve">How each agreement worked, for you and for the teammate involved</w:t>
             </w:r>
           </w:p>
           <w:p>
@@ -937,7 +663,7 @@
         </w:tc>
         <w:tc>
           <w:tcPr>
-            <w:tcW w:type="dxa" w:w="3753"/>
+            <w:tcW w:type="dxa" w:w="7506"/>
             <w:tcBorders>
               <w:top w:val="single" w:color="E4E4E7" w:sz="4"/>
               <w:left w:val="single" w:color="E4E4E7" w:sz="4"/>
@@ -962,41 +688,6 @@
                 <w:szCs w:val="16"/>
               </w:rPr>
               <w:t xml:space="preserve">Next-scope responsibilities you want to take on this cycle, if any</w:t>
-            </w:r>
-          </w:p>
-          <w:p>
-            <w:pPr>
-              <w:spacing w:after="700"/>
-            </w:pPr>
-          </w:p>
-        </w:tc>
-        <w:tc>
-          <w:tcPr>
-            <w:tcW w:type="dxa" w:w="3753"/>
-            <w:tcBorders>
-              <w:top w:val="single" w:color="E4E4E7" w:sz="4"/>
-              <w:left w:val="single" w:color="E4E4E7" w:sz="4"/>
-              <w:bottom w:val="single" w:color="E4E4E7" w:sz="4"/>
-              <w:right w:val="single" w:color="E4E4E7" w:sz="4"/>
-            </w:tcBorders>
-            <w:tcMar>
-              <w:top w:type="dxa" w:w="120"/>
-              <w:left w:type="dxa" w:w="180"/>
-              <w:bottom w:type="dxa" w:w="120"/>
-              <w:right w:type="dxa" w:w="180"/>
-            </w:tcMar>
-          </w:tcPr>
-          <w:p>
-            <w:pPr>
-              <w:spacing w:after="60"/>
-            </w:pPr>
-            <w:r>
-              <w:rPr>
-                <w:color w:val="6B7280"/>
-                <w:sz w:val="16"/>
-                <w:szCs w:val="16"/>
-              </w:rPr>
-              <w:t xml:space="preserve">How far you got with them, and what you want to take on next cycle</w:t>
             </w:r>
           </w:p>
           <w:p>

</xml_diff>